<commit_message>
Auto commit (2026-10-14 11:47) — 3 changes
Claude Code 세션 종료 시 자동 커밋.

Co-Authored-By: Claude <noreply@anthropic.com>
Claude-Session: https://claude.ai/code/f8cf7277-50d4-44b2-aa90-ae76764cd546
</commit_message>
<xml_diff>
--- a/projects/36_slave_dragon_king/노예라 불린 용의 공주_피칭페이지_v3.docx
+++ b/projects/36_slave_dragon_king/노예라 불린 용의 공주_피칭페이지_v3.docx
@@ -1202,7 +1202,7 @@
           <w:color w:val="1A1A1A"/>
           <w:sz w:val="22"/>
         </w:rPr>
-        <w:t>반란의 밤 여왕 엘레노어가 숨지자, 시녀 사라는 여왕의 반지를 제 딸 바네사의 강보에 넣어 여왕의 딸 아이비와 바꿔친다. 20년 뒤 바네사는 아이비의 친오빠인 세 왕자가 떠받드는 공주, 아이비는 사라를 어머니로 아는 용 사육장 노예다. 둘의 생일인 축제 날, 마차에 치일 뻔한 아이비에게서 흰 용 환영이 터진다. 오빠들은 바네사 말만 믿고 아이비를 짓밟고, 바네사의 약혼자인 북부 용족 대공 웨슬리만 아이비에게 끌린다. 무릎 꿇린 아이비가 바닥 과일에 얼굴을 숙이는 순간 반지가 빛난다.</w:t>
+        <w:t>반란의 밤 여왕 엘레노어가 숨지자, 시녀 사라는 여왕의 반지를 제 딸 바네사의 강보에 넣어 여왕의 딸 아이비와 바꿔친다. 20년 뒤 바네사는 아이비의 친오빠인 세 왕자가 피로 맹세해 지키는 공주로 자라 있다. 아이비는 사라를 어머니로 알고 용 사육장에서 노예로 산다.</w:t>
       </w:r>
     </w:p>
     <w:p>
@@ -1217,7 +1217,7 @@
           <w:color w:val="1A1A1A"/>
           <w:sz w:val="22"/>
         </w:rPr>
-        <w:t>바네사가 엘레노어가 자기를 알아봤다고 외치자, 오빠들은 남북 용족이 다 모인 앞에서 하겠다며 혈통 의식과 대관식을 미룬다. 반지가 아이비 앞에서 빛난 걸 본 바네사는 아이비를 몸종으로 궁에 끌고 가, 엘레노어 동상을 깨고 누명을 씌워 감옥에 넣는다. 웨슬리가 감옥 문을 부수려 해도 아이비는 도망치면 어머니 사라가 대신 벌을 받는다며 남는다. 대관식 전날 사라가 바네사에게 자기가 친어머니라고 털어놓자, 바네사는 사라와 짜고 피를 안 내놓으면 사라를 죽이겠다고 아이비를 거짓 협박한다. 아이비는 단상 밑에서 쇠사슬에 묶이고, 바네사는 반지를 빛내려고 아이비의 피를 마신다.</w:t>
+        <w:t>바네사의 생일 축제 날은 아이비의 생일이기도 하다. 그날 오빠들은 바네사 말만 믿고 아이비를 짓밟는데, 바네사의 약혼자인 북부 용족 대공 웨슬리만 아이비에게 끌린다. 짓밟힌 아이비 앞에서 반지가 빛난다. 그 뒤 사라에게서 자기가 가짜라는 말을 들은 바네사는, 아이비를 붙잡아 두고 그 피를 마셔 공주 흉내를 낸다.</w:t>
       </w:r>
     </w:p>
     <w:p>
@@ -1232,7 +1232,7 @@
           <w:color w:val="1A1A1A"/>
           <w:sz w:val="22"/>
         </w:rPr>
-        <w:t>대관식 날 웨슬리는 노예를 사육장으로 돌려보냈다는 바네사의 거짓말에 혼자 사육장을 뒤진다. 의식에서 바네사의 반지는 희미하게 깜박일 뿐, 단상 밑 아이비의 피가 깨어나 쇠사슬이 끊기고 흰 날개가 돋는다. 오빠들이 흔들리자 사라는 갓난 아이비에게 바네사의 피를 훔쳐 먹였다고 거짓 자백하고, 바네사가 매달린다. "오빠, 내 피가 저 몸에 갇혀 있어." 두 오빠가 아이비를 붙잡고 에드워드가 제 손으로 날개를 뜯는다. 아이비의 비명에 황금 용 웨슬리가 의식장 지붕을 뚫고 내려와 아이비를 날개로 감싼다. 에드워드가 "막아서면 너도 같이 죽는다." 하자 웨슬리가 답한다. "그럼 같이 죽자. 너희 삼 형제도 데리고."</w:t>
+        <w:t>미뤄진 혈통 의식 날, 정작 흰 날개가 돋는 쪽은 아이비다. 사라가 갓난 아이비에게 공주의 피를 훔쳐 먹였다고 거짓 자백하자, 에드워드가 제 손으로 그 날개를 뜯는다. 사라진 아이비를 찾아 헤매던 웨슬리가 황금 용이 되어 지붕을 뚫고 내려와 아이비를 감싼다. 에드워드가 막아서면 같이 죽는다고 하자 웨슬리가 답한다. "그럼 같이 죽자. 너희 삼 형제도 데리고."</w:t>
       </w:r>
     </w:p>
     <w:p>
@@ -1247,7 +1247,7 @@
           <w:color w:val="1A1A1A"/>
           <w:sz w:val="22"/>
         </w:rPr>
-        <w:t>웨슬리가 아이비를 안고 빠져나가자 바네사는 둘이 오빠들을 죽이려 했다며 군사를 보낸다. 숲에서 아이비는 웨슬리 품에서 처음 온전한 흰 용이 되고, 뒤쫓던 오빠들은 그 모습에서 어머니 엘레노어를 본다. 용서를 비는 오빠들에게 아이비가 말한다. "스무 해 동안 아무도 날 찾으러 오지 않았어요." 도미닉은 진실을 알고도 바네사를 감싸다 바네사가 먹인 독에 숨지고, 숲의 아이비는 그 일을 모른다. 바네사는 친어머니 사라까지 처형하고 대관식을 다시 연다. 아이비가 웨슬리와 함께 그 자리에 나타나자, 세바스찬은 남북 용족 앞에서 자기가 씌워 준 어머니의 왕관을 바네사 머리에서 벗기고 자기들이 진짜 공주의 날개를 뜯었다고 털어놓는다. 반지는 아이비를 고른다. 바네사가 흑룡의 힘으로 불길을 뿜자 에드워드가 아이비를 막아서다 자기 날개를 잃는다. 아이비는 바네사를 쓰러뜨려 용 사육장으로 보낸다. 무릎 꿇은 에드워드와 세바스찬을 아이비는 처음으로 "오빠"라고 부르며 일으켜 세운다. 그 자리에 도미닉은 없다. 아이비는 남부 용족 여왕이 되어 웨슬리와 맺어진다.</w:t>
+        <w:t>오빠들은 흰 용이 된 아이비에게서 자기들 어머니를 보고서야 진실을 알지만 늦었다. 도미닉은 끝까지 바네사를 감싸다 바네사가 먹인 독에 죽는다. 세바스찬은 남북 용족 앞에서 자기가 씌워 준 왕관을 바네사에게서 벗긴다. 몰린 바네사가 흑룡의 힘을 빌려 불길을 뿜자, 에드워드는 아이비 앞을 막아서다 제 날개를 잃는다. 아이비는 바네사가 훔쳐 간 힘을 도로 뜯어내고, 쇠사슬을 채워 용 사육장으로 보낸다. 반지를 되찾아 여왕이 된 아이비는 무릎 꿇은 에드워드와 세바스찬을 처음으로 "오빠"라고 부르며 일으켜 세운다. 그 자리에 도미닉은 없다. 아이비는 웨슬리와 맺어진다.</w:t>
       </w:r>
     </w:p>
     <w:p>

</xml_diff>

<commit_message>
Auto commit (2026-10-14 11:50) — 3 changes
Claude Code 세션 종료 시 자동 커밋.

Co-Authored-By: Claude <noreply@anthropic.com>
</commit_message>
<xml_diff>
--- a/projects/36_slave_dragon_king/노예라 불린 용의 공주_피칭페이지_v3.docx
+++ b/projects/36_slave_dragon_king/노예라 불린 용의 공주_피칭페이지_v3.docx
@@ -425,7 +425,22 @@
           <w:color w:val="1A1A1A"/>
           <w:sz w:val="22"/>
         </w:rPr>
-        <w:t>한 끗: 원작은 노예가 된 진짜 왕자가 왕좌를 되찾는 이야기. 우리는 피로 맹세한 세 오빠가 노예가 된 진짜 동생을 몰라보고 짓밟는 이야기.</w:t>
+        <w:t>레퍼런스작은 노예가 된 진짜 왕자가 왕좌를 되찾는 이야기.</w:t>
+      </w:r>
+    </w:p>
+    <w:p>
+      <w:pPr>
+        <w:keepNext w:val="0"/>
+        <w:spacing w:after="120" w:before="0" w:line="312" w:lineRule="auto"/>
+      </w:pPr>
+      <w:r>
+        <w:rPr>
+          <w:rFonts w:ascii="맑은 고딕" w:hAnsi="맑은 고딕" w:eastAsia="맑은 고딕"/>
+          <w:b w:val="0"/>
+          <w:color w:val="1A1A1A"/>
+          <w:sz w:val="22"/>
+        </w:rPr>
+        <w:t>이 작품은 동생을 지키기로 맹세한 세 오빠가 노예로 자란 진짜 동생을 몰라보고 짓밟는 이야기.</w:t>
       </w:r>
     </w:p>
     <w:p>
@@ -456,7 +471,7 @@
           <w:color w:val="1A1A1A"/>
           <w:sz w:val="22"/>
         </w:rPr>
-        <w:t>· 원작: 광산 노예가 된 진짜 왕자를 아버지 한 명이 짓밟음.</w:t>
+        <w:t>· 레퍼런스: 진짜 왕자를 아버지 한 명이 짓밟음.</w:t>
       </w:r>
     </w:p>
     <w:p>
@@ -472,7 +487,22 @@
           <w:color w:val="1A1A1A"/>
           <w:sz w:val="22"/>
         </w:rPr>
-        <w:t>· 우리: 용 사육장 노예가 된 진짜 공주 아이비를, 가짜 공주 바네사를 막내로 알고 지키겠다고 피로 맹세한 오빠 셋이 짓밟음(맹세 3화 · 짓밟는 장면 4·8화).</w:t>
+        <w:t>· 변경: 진짜 공주를 오빠 셋이 짓밟음.</w:t>
+      </w:r>
+    </w:p>
+    <w:p>
+      <w:pPr>
+        <w:keepNext/>
+        <w:spacing w:after="40" w:before="160" w:line="312" w:lineRule="auto"/>
+      </w:pPr>
+      <w:r>
+        <w:rPr>
+          <w:rFonts w:ascii="맑은 고딕" w:hAnsi="맑은 고딕" w:eastAsia="맑은 고딕"/>
+          <w:b/>
+          <w:color w:val="1A1A1A"/>
+          <w:sz w:val="22"/>
+        </w:rPr>
+        <w:t>주인공의 동기</w:t>
       </w:r>
     </w:p>
     <w:p>
@@ -488,22 +518,7 @@
           <w:color w:val="1A1A1A"/>
           <w:sz w:val="22"/>
         </w:rPr>
-        <w:t>· 이유: 비글루 시청자는 여성이 절대다수. 원작 광고 B(3분)의 속마음도 날개를 뜯는 친아버지를 "왜 미워할 수가 없을까". 그래서 주인공을 공주로 바꾸고, 진짜를 몰라보고 짓밟는데도 미워할 수 없는 가족을 한 명에서 셋으로 늘림.</w:t>
-      </w:r>
-    </w:p>
-    <w:p>
-      <w:pPr>
-        <w:keepNext/>
-        <w:spacing w:after="40" w:before="160" w:line="312" w:lineRule="auto"/>
-      </w:pPr>
-      <w:r>
-        <w:rPr>
-          <w:rFonts w:ascii="맑은 고딕" w:hAnsi="맑은 고딕" w:eastAsia="맑은 고딕"/>
-          <w:b/>
-          <w:color w:val="1A1A1A"/>
-          <w:sz w:val="22"/>
-        </w:rPr>
-        <w:t>왕좌에서 오해로</w:t>
+        <w:t>· 레퍼런스: 투기장에서 이겨 노예 목줄을 벗으려고 싸움.</w:t>
       </w:r>
     </w:p>
     <w:p>
@@ -519,39 +534,7 @@
           <w:color w:val="1A1A1A"/>
           <w:sz w:val="22"/>
         </w:rPr>
-        <w:t>· 원작: 진짜 왕자가 "투기장에서 이겨 이 목줄을 벗겠다"며 스스로 싸우러 감(원작 2화).</w:t>
-      </w:r>
-    </w:p>
-    <w:p>
-      <w:pPr>
-        <w:keepNext w:val="0"/>
-        <w:spacing w:after="40" w:before="0" w:line="312" w:lineRule="auto"/>
-        <w:ind w:left="280"/>
-      </w:pPr>
-      <w:r>
-        <w:rPr>
-          <w:rFonts w:ascii="맑은 고딕" w:hAnsi="맑은 고딕" w:eastAsia="맑은 고딕"/>
-          <w:b w:val="0"/>
-          <w:color w:val="1A1A1A"/>
-          <w:sz w:val="22"/>
-        </w:rPr>
-        <w:t>· 우리: 아이비는 왕좌를 노리지 않음. 공주를 축복하러 축제에 가고(2~3화), 자기를 때리는 어머니 사라에게 줄 과일을 챙기고(7화), 바네사가 가족까지 화를 입을 거라고 협박하자 바닥에 짓뭉개진 과일 쪽으로 얼굴을 숙임(8화). 그 어머니가 아이비를 바꿔치기한 시녀라는 건 시청자만 앎(1화).</w:t>
-      </w:r>
-    </w:p>
-    <w:p>
-      <w:pPr>
-        <w:keepNext w:val="0"/>
-        <w:spacing w:after="40" w:before="0" w:line="312" w:lineRule="auto"/>
-        <w:ind w:left="280"/>
-      </w:pPr>
-      <w:r>
-        <w:rPr>
-          <w:rFonts w:ascii="맑은 고딕" w:hAnsi="맑은 고딕" w:eastAsia="맑은 고딕"/>
-          <w:b w:val="0"/>
-          <w:color w:val="1A1A1A"/>
-          <w:sz w:val="22"/>
-        </w:rPr>
-        <w:t>· 이유: 원작 광고 두 편의 정점도 왕좌를 되찾는 장면이 아니라, 가족이 진짜를 몰라보고 가짜 편에서 짓밟는 장면.</w:t>
+        <w:t>· 변경: 가족이 다칠까 봐 굴욕을 참음.</w:t>
       </w:r>
     </w:p>
     <w:p>
@@ -582,7 +565,7 @@
           <w:color w:val="1A1A1A"/>
           <w:sz w:val="22"/>
         </w:rPr>
-        <w:t>· 원작: 무대가 왕실 투기장의 결투.</w:t>
+        <w:t>· 레퍼런스: 무대가 왕실 투기장.</w:t>
       </w:r>
     </w:p>
     <w:p>
@@ -598,23 +581,7 @@
           <w:color w:val="1A1A1A"/>
           <w:sz w:val="22"/>
         </w:rPr>
-        <w:t>· 우리: 무대가 바네사의 스무 번째 생일 축제. 새 용의 여왕 발표와 북부 대공이 바네사에게 하는 청혼이 같은 날 같은 자리에서 열림(2~3화). 그날은 아이비의 스무 번째 생일이기도 함(2·5화).</w:t>
-      </w:r>
-    </w:p>
-    <w:p>
-      <w:pPr>
-        <w:keepNext w:val="0"/>
-        <w:spacing w:after="40" w:before="0" w:line="312" w:lineRule="auto"/>
-        <w:ind w:left="280"/>
-      </w:pPr>
-      <w:r>
-        <w:rPr>
-          <w:rFonts w:ascii="맑은 고딕" w:hAnsi="맑은 고딕" w:eastAsia="맑은 고딕"/>
-          <w:b w:val="0"/>
-          <w:color w:val="1A1A1A"/>
-          <w:sz w:val="22"/>
-        </w:rPr>
-        <w:t>· 이유: 오해가 터지려면 오빠 셋과 약혼자와 가짜가 진짜와 한자리에 있어야 해서, 그들이 다 모이는 날로 바꿈.</w:t>
+        <w:t>· 변경: 무대가 가짜 공주의 생일 축제. 그날은 진짜 공주의 생일이기도 함.</w:t>
       </w:r>
     </w:p>
     <w:p>
@@ -645,7 +612,7 @@
           <w:color w:val="1A1A1A"/>
           <w:sz w:val="22"/>
         </w:rPr>
-        <w:t>· 원작: 가짜 왕자의 약혼녀가 진짜 왕자에게 끌림. 진짜 왕자의 날개가 뜯길 땐 약혼자 손에 붙잡혀 못 막고, 그 뒤 처형만 몸으로 막으며 "그럼 그와 함께 죽겠어요".</w:t>
+        <w:t>· 레퍼런스: 가짜 왕자의 약혼녀가 진짜 왕자에게 끌림.</w:t>
       </w:r>
     </w:p>
     <w:p>
@@ -661,23 +628,7 @@
           <w:color w:val="1A1A1A"/>
           <w:sz w:val="22"/>
         </w:rPr>
-        <w:t>· 우리: 바네사의 약혼자인 북부 용족 대공 웨슬리가 황금 용에서 사람으로 변하자마자, 약혼녀가 아니라 연회장 식탁 옆의 노예 아이비에게 끌림(6화). 혈통 의식 날엔 사라진 아이비를 찾아 사육장을 뒤지다, 아이비의 비명에 황금 용으로 의식장 지붕을 뚫고 내려옴(유료 구간).</w:t>
-      </w:r>
-    </w:p>
-    <w:p>
-      <w:pPr>
-        <w:keepNext w:val="0"/>
-        <w:spacing w:after="40" w:before="0" w:line="312" w:lineRule="auto"/>
-        <w:ind w:left="280"/>
-      </w:pPr>
-      <w:r>
-        <w:rPr>
-          <w:rFonts w:ascii="맑은 고딕" w:hAnsi="맑은 고딕" w:eastAsia="맑은 고딕"/>
-          <w:b w:val="0"/>
-          <w:color w:val="1A1A1A"/>
-          <w:sz w:val="22"/>
-        </w:rPr>
-        <w:t>· 이유: 주인공이 공주가 됐으니 진짜 공주에게 끌리는 쪽도 남자 주인공이 됨. 원작 약혼녀의 마지막 대사는 힘없는 사람이 몸으로 막는 말이라, 황금 용인 웨슬리에겐 아이비를 날개로 감싼 채 하는 "그럼 같이 죽자. 너희 삼 형제도 데리고."로 바꿈.</w:t>
+        <w:t>· 변경: 가짜 공주의 약혼자인 북부 용족 대공 웨슬리가 진짜 공주에게 끌림.</w:t>
       </w:r>
     </w:p>
     <w:p>
@@ -782,7 +733,7 @@
           <w:color w:val="1A1A1A"/>
           <w:sz w:val="22"/>
         </w:rPr>
-        <w:t>→ 장면 순서는 그대로 두고, 원작에서 친아버지가 하던 날개 뜯기는 첫째 오빠가, 붙잡기는 두 오빠가 함. 늘 가짜 편이던 키운 아버지 자리는 사라가 받음. 마지막 대사는 원작에서 그 자리에 서 있던 약혼녀 대신, 지붕을 뚫고 내려온 웨슬리가 함.</w:t>
+        <w:t>→ 장면 순서는 원작 광고 B와 같음. 날개는 첫째 오빠가 뜯고, 두 오빠가 아이비를 붙잡음. 속마음 첫 줄의 늘 가짜 편인 사람은 우리 이야기에선 사라. 마지막 대사는 옆에 서 있던 약혼녀가 아니라, 지붕을 뚫고 내려온 웨슬리가 함.</w:t>
       </w:r>
     </w:p>
     <w:p>
@@ -1022,7 +973,7 @@
           <w:color w:val="1A1A1A"/>
           <w:sz w:val="22"/>
         </w:rPr>
-        <w:t>북부 용족 대공이자 바네사의 약혼자다. 청혼하러 황금 용으로 광장에 내려앉은 순간, 약혼녀를 두고 노예 아이비에게 눈이 간다. "운명이 정한 내 여왕이 바로 눈앞에 있는데…… 왜 다른 여자한테 끌리는 거지?" 유료에서는 의식 날 사라진 아이비를 찾아 사육장을 뒤지다가, 아이비의 비명에 황금 용으로 의식장 지붕을 뚫고 내려온다.</w:t>
+        <w:t>북부 용족 대공이자 바네사의 약혼자다. 청혼하러 황금 용으로 광장에 내려앉은 순간, 약혼녀를 두고 노예 아이비에게 눈이 간다. "운명이 정한 내 여왕이 바로 눈앞에 있는데…… 왜 다른 여자한테 끌리는 거지?" 유료에서는 의식이 열리는 밤 사라진 아이비를 찾아 헤매다가, 아이비의 비명에 황금 용으로 의식장 지붕을 뚫고 내려온다.</w:t>
       </w:r>
     </w:p>
     <w:p>
@@ -1217,7 +1168,7 @@
           <w:color w:val="1A1A1A"/>
           <w:sz w:val="22"/>
         </w:rPr>
-        <w:t>바네사의 생일 축제 날은 아이비의 생일이기도 하다. 그날 오빠들은 바네사 말만 믿고 아이비를 짓밟는데, 바네사의 약혼자인 북부 용족 대공 웨슬리만 아이비에게 끌린다. 짓밟힌 아이비 앞에서 반지가 빛난다. 그 뒤 사라에게서 자기가 가짜라는 말을 들은 바네사는, 아이비를 붙잡아 두고 그 피를 마셔 공주 흉내를 낸다.</w:t>
+        <w:t>바네사의 스무 번째 생일 축제 날은 아이비의 생일이기도 하다. 오빠들은 축제 마지막에 바네사 몸속의 흰 용을 깨우는 혈통 의식을 열 참이다. 축제 내내 오빠들은 바네사 말만 믿고 아이비를 짓밟고, 바네사의 약혼자인 북부 용족 대공 웨슬리만 아이비에게 끌린다. 짓밟힌 아이비 앞에서 반지가 빛난다. 그날 사라에게서 자기가 가짜라는 말을 들은 바네사는, 아이비를 몰래 붙잡아 그 피를 마시고 의식에 선다.</w:t>
       </w:r>
     </w:p>
     <w:p>
@@ -1232,7 +1183,7 @@
           <w:color w:val="1A1A1A"/>
           <w:sz w:val="22"/>
         </w:rPr>
-        <w:t>미뤄진 혈통 의식 날, 정작 흰 날개가 돋는 쪽은 아이비다. 사라가 갓난 아이비에게 공주의 피를 훔쳐 먹였다고 거짓 자백하자, 에드워드가 제 손으로 그 날개를 뜯는다. 사라진 아이비를 찾아 헤매던 웨슬리가 황금 용이 되어 지붕을 뚫고 내려와 아이비를 감싼다. 에드워드가 막아서면 같이 죽는다고 하자 웨슬리가 답한다. "그럼 같이 죽자. 너희 삼 형제도 데리고."</w:t>
+        <w:t>그런데 의식에서 흰 날개가 돋는 쪽은 아이비다. 사라가 갓난 아이비에게 공주의 피를 훔쳐 먹였다고 거짓 자백하자, 에드워드가 제 손으로 그 날개를 뜯는다. 사라진 아이비를 찾아 헤매던 웨슬리가 황금 용이 되어 지붕을 뚫고 내려와 아이비를 감싼다. 에드워드가 막아서면 같이 죽는다고 하자 웨슬리가 답한다. "그럼 같이 죽자. 너희 삼 형제도 데리고."</w:t>
       </w:r>
     </w:p>
     <w:p>
@@ -1247,7 +1198,7 @@
           <w:color w:val="1A1A1A"/>
           <w:sz w:val="22"/>
         </w:rPr>
-        <w:t>오빠들은 흰 용이 된 아이비에게서 자기들 어머니를 보고서야 진실을 알지만 늦었다. 도미닉은 끝까지 바네사를 감싸다 바네사가 먹인 독에 죽는다. 세바스찬은 남북 용족 앞에서 자기가 씌워 준 왕관을 바네사에게서 벗긴다. 몰린 바네사가 흑룡의 힘을 빌려 불길을 뿜자, 에드워드는 아이비 앞을 막아서다 제 날개를 잃는다. 아이비는 바네사가 훔쳐 간 힘을 도로 뜯어내고, 쇠사슬을 채워 용 사육장으로 보낸다. 반지를 되찾아 여왕이 된 아이비는 무릎 꿇은 에드워드와 세바스찬을 처음으로 "오빠"라고 부르며 일으켜 세운다. 그 자리에 도미닉은 없다. 아이비는 웨슬리와 맺어진다.</w:t>
+        <w:t>오빠들은 흰 용이 된 아이비에게서 자기들 어머니를 보고서야 진실을 알지만 늦었다. 도미닉은 끝까지 바네사를 감싸다 바네사가 먹인 독에 죽는다. 그래도 바네사가 여왕 자리에 오르려 하자, 세바스찬은 남북 용족 앞에서 자기가 씌워 준 왕관을 바네사 머리에서 벗긴다. 몰린 바네사가 흑룡의 힘을 빌려 불길을 뿜자, 에드워드는 아이비 앞을 막아서다 제 날개를 잃는다. 아이비는 바네사가 훔쳐 간 힘을 도로 뜯어내고, 쇠사슬을 채워 용 사육장으로 보낸다. 어머니 엘레노어의 반지를 끼고 여왕이 된 아이비는 무릎 꿇은 에드워드와 세바스찬을 처음으로 "오빠"라고 부르며 일으켜 세운다. 그 자리에 도미닉은 없다. 아이비는 웨슬리와 맺어진다.</w:t>
       </w:r>
     </w:p>
     <w:p>

</xml_diff>

<commit_message>
Auto commit (2026-10-14 11:55) — 3 changes
Claude Code 세션 종료 시 자동 커밋.

Co-Authored-By: Claude <noreply@anthropic.com>
</commit_message>
<xml_diff>
--- a/projects/36_slave_dragon_king/노예라 불린 용의 공주_피칭페이지_v3.docx
+++ b/projects/36_slave_dragon_king/노예라 불린 용의 공주_피칭페이지_v3.docx
@@ -440,7 +440,7 @@
           <w:color w:val="1A1A1A"/>
           <w:sz w:val="22"/>
         </w:rPr>
-        <w:t>이 작품은 동생을 지키기로 맹세한 세 오빠가 노예로 자란 진짜 동생을 몰라보고 짓밟는 이야기.</w:t>
+        <w:t>이 작품은 동생을 지키기로 맹세한 세 오빠가 노예가 된 진짜 동생을 몰라보고 짓밟는 이야기.</w:t>
       </w:r>
     </w:p>
     <w:p>
@@ -455,7 +455,7 @@
           <w:color w:val="1A1A1A"/>
           <w:sz w:val="22"/>
         </w:rPr>
-        <w:t>왕자에서 공주로, 아버지에서 오빠 셋으로</w:t>
+        <w:t>주인공 성별, 가족 구성 변경</w:t>
       </w:r>
     </w:p>
     <w:p>
@@ -471,7 +471,22 @@
           <w:color w:val="1A1A1A"/>
           <w:sz w:val="22"/>
         </w:rPr>
-        <w:t>· 레퍼런스: 진짜 왕자를 아버지 한 명이 짓밟음.</w:t>
+        <w:t>· 이유: 비글루 시청자는 여성이 절대다수. 이에 따라 레퍼런스작보다 여성층에 좀 더 어필할 수 있도록 주인공을 여성으로 바꿈. 가짜 편에 서서 진짜를 짓밟다가 뒤늦게 후회할 가족, 즉 오해와 박해의 주체는 아버지 한 명 대신 오빠 셋.</w:t>
+      </w:r>
+    </w:p>
+    <w:p>
+      <w:pPr>
+        <w:keepNext/>
+        <w:spacing w:after="40" w:before="160" w:line="312" w:lineRule="auto"/>
+      </w:pPr>
+      <w:r>
+        <w:rPr>
+          <w:rFonts w:ascii="맑은 고딕" w:hAnsi="맑은 고딕" w:eastAsia="맑은 고딕"/>
+          <w:b/>
+          <w:color w:val="1A1A1A"/>
+          <w:sz w:val="22"/>
+        </w:rPr>
+        <w:t>주인공의 성격, 동기 등 변경</w:t>
       </w:r>
     </w:p>
     <w:p>
@@ -487,22 +502,7 @@
           <w:color w:val="1A1A1A"/>
           <w:sz w:val="22"/>
         </w:rPr>
-        <w:t>· 변경: 진짜 공주를 오빠 셋이 짓밟음.</w:t>
-      </w:r>
-    </w:p>
-    <w:p>
-      <w:pPr>
-        <w:keepNext/>
-        <w:spacing w:after="40" w:before="160" w:line="312" w:lineRule="auto"/>
-      </w:pPr>
-      <w:r>
-        <w:rPr>
-          <w:rFonts w:ascii="맑은 고딕" w:hAnsi="맑은 고딕" w:eastAsia="맑은 고딕"/>
-          <w:b/>
-          <w:color w:val="1A1A1A"/>
-          <w:sz w:val="22"/>
-        </w:rPr>
-        <w:t>주인공의 동기</w:t>
+        <w:t>· 레퍼런스: 진짜 왕자가 "투기장에서 이겨 이 목줄을 벗겠다"며 스스로 싸우러 감. 자유에 대한 갈망.</w:t>
       </w:r>
     </w:p>
     <w:p>
@@ -518,23 +518,7 @@
           <w:color w:val="1A1A1A"/>
           <w:sz w:val="22"/>
         </w:rPr>
-        <w:t>· 레퍼런스: 투기장에서 이겨 노예 목줄을 벗으려고 싸움.</w:t>
-      </w:r>
-    </w:p>
-    <w:p>
-      <w:pPr>
-        <w:keepNext w:val="0"/>
-        <w:spacing w:after="40" w:before="0" w:line="312" w:lineRule="auto"/>
-        <w:ind w:left="280"/>
-      </w:pPr>
-      <w:r>
-        <w:rPr>
-          <w:rFonts w:ascii="맑은 고딕" w:hAnsi="맑은 고딕" w:eastAsia="맑은 고딕"/>
-          <w:b w:val="0"/>
-          <w:color w:val="1A1A1A"/>
-          <w:sz w:val="22"/>
-        </w:rPr>
-        <w:t>· 변경: 가족이 다칠까 봐 굴욕을 참음.</w:t>
+        <w:t>· 변경: 아이비는 왕좌를 노리지 않음. 공주를 축복하러 축제에 가고, 자기를 때리는 어머니 사라에게 줄 과일을 챙기고, 바네사가 가족까지 화를 입을 거라고 협박하자 바닥에 짓뭉개진 과일 쪽으로 얼굴을 숙임. 주인공의 목적, 감정, 행동 원리를 다르게 가져감.</w:t>
       </w:r>
     </w:p>
     <w:p>
@@ -549,7 +533,7 @@
           <w:color w:val="1A1A1A"/>
           <w:sz w:val="22"/>
         </w:rPr>
-        <w:t>투기장 결투에서 생일 축제로</w:t>
+        <w:t>무대 변경</w:t>
       </w:r>
     </w:p>
     <w:p>
@@ -596,7 +580,7 @@
           <w:color w:val="1A1A1A"/>
           <w:sz w:val="22"/>
         </w:rPr>
-        <w:t>가짜의 약혼녀에서 가짜의 약혼자로</w:t>
+        <w:t>가짜의 약혼 상대 변경</w:t>
       </w:r>
     </w:p>
     <w:p>
@@ -628,7 +612,7 @@
           <w:color w:val="1A1A1A"/>
           <w:sz w:val="22"/>
         </w:rPr>
-        <w:t>· 변경: 가짜 공주의 약혼자인 북부 용족 대공 웨슬리가 진짜 공주에게 끌림.</w:t>
+        <w:t>· 변경: 바네사의 약혼자인 북부 용족 대공 웨슬리가 황금 용에서 사람으로 변하자마자, 약혼녀가 아니라 연회장 식탁 옆의 노예 아이비에게 끌림. 주인공 성별 전환에 따른 자연스러운 변경.</w:t>
       </w:r>
     </w:p>
     <w:p>

</xml_diff>